<commit_message>
Add /forecast, /whatif, /explain, /anomaly endpoints; fix year-trend bias in model
</commit_message>
<xml_diff>
--- a/API_CONTRACT.docx
+++ b/API_CONTRACT.docx
@@ -12,6 +12,26 @@
         <w:rPr>
           <w:color w:val="000000" w:themeColor="text1"/>
         </w:rPr>
+        <w:t>Unit is MW</w:t>
+      </w:r>
+    </w:p>
+    <w:p>
+      <w:pPr>
+        <w:rPr>
+          <w:color w:val="000000" w:themeColor="text1"/>
+        </w:rPr>
+      </w:pPr>
+    </w:p>
+    <w:p>
+      <w:pPr>
+        <w:rPr>
+          <w:color w:val="000000" w:themeColor="text1"/>
+        </w:rPr>
+      </w:pPr>
+      <w:r>
+        <w:rPr>
+          <w:color w:val="000000" w:themeColor="text1"/>
+        </w:rPr>
         <w:t>## POST /forecast</w:t>
       </w:r>
     </w:p>
@@ -402,6 +422,7 @@
         <w:rPr>
           <w:color w:val="000000" w:themeColor="text1"/>
         </w:rPr>
+        <w:lastRenderedPageBreak/>
         <w:t xml:space="preserve">    { "name": "</w:t>
       </w:r>
       <w:proofErr w:type="spellStart"/>
@@ -456,7 +477,6 @@
         <w:rPr>
           <w:color w:val="000000" w:themeColor="text1"/>
         </w:rPr>
-        <w:lastRenderedPageBreak/>
         <w:t>}</w:t>
       </w:r>
     </w:p>
@@ -875,25 +895,7 @@
     </w:p>
     <w:p>
       <w:pPr>
-        <w:tabs>
-          <w:tab w:val="left" w:pos="916"/>
-          <w:tab w:val="left" w:pos="1832"/>
-          <w:tab w:val="left" w:pos="2748"/>
-          <w:tab w:val="left" w:pos="3664"/>
-          <w:tab w:val="left" w:pos="4580"/>
-          <w:tab w:val="left" w:pos="5496"/>
-          <w:tab w:val="left" w:pos="6412"/>
-          <w:tab w:val="left" w:pos="7328"/>
-          <w:tab w:val="left" w:pos="8244"/>
-          <w:tab w:val="left" w:pos="9160"/>
-          <w:tab w:val="left" w:pos="10076"/>
-          <w:tab w:val="left" w:pos="10992"/>
-          <w:tab w:val="left" w:pos="11908"/>
-          <w:tab w:val="left" w:pos="12824"/>
-          <w:tab w:val="left" w:pos="13740"/>
-          <w:tab w:val="left" w:pos="14656"/>
-        </w:tabs>
-        <w:spacing w:after="0" w:line="240" w:lineRule="auto"/>
+        <w:spacing w:before="100" w:beforeAutospacing="1" w:after="100" w:afterAutospacing="1" w:line="240" w:lineRule="auto"/>
         <w:rPr>
           <w:rFonts w:ascii="var(--font-mono)" w:eastAsia="Times New Roman" w:hAnsi="var(--font-mono)" w:cs="Courier New"/>
           <w:color w:val="000000" w:themeColor="text1"/>
@@ -914,30 +916,13 @@
           <w:lang w:eastAsia="en-GB"/>
           <w14:ligatures w14:val="none"/>
         </w:rPr>
+        <w:lastRenderedPageBreak/>
         <w:t>GET /locations</w:t>
       </w:r>
     </w:p>
     <w:p>
       <w:pPr>
-        <w:tabs>
-          <w:tab w:val="left" w:pos="916"/>
-          <w:tab w:val="left" w:pos="1832"/>
-          <w:tab w:val="left" w:pos="2748"/>
-          <w:tab w:val="left" w:pos="3664"/>
-          <w:tab w:val="left" w:pos="4580"/>
-          <w:tab w:val="left" w:pos="5496"/>
-          <w:tab w:val="left" w:pos="6412"/>
-          <w:tab w:val="left" w:pos="7328"/>
-          <w:tab w:val="left" w:pos="8244"/>
-          <w:tab w:val="left" w:pos="9160"/>
-          <w:tab w:val="left" w:pos="10076"/>
-          <w:tab w:val="left" w:pos="10992"/>
-          <w:tab w:val="left" w:pos="11908"/>
-          <w:tab w:val="left" w:pos="12824"/>
-          <w:tab w:val="left" w:pos="13740"/>
-          <w:tab w:val="left" w:pos="14656"/>
-        </w:tabs>
-        <w:spacing w:after="0" w:line="240" w:lineRule="auto"/>
+        <w:spacing w:before="100" w:beforeAutospacing="1" w:after="100" w:afterAutospacing="1" w:line="240" w:lineRule="auto"/>
         <w:rPr>
           <w:rFonts w:ascii="var(--font-mono)" w:eastAsia="Times New Roman" w:hAnsi="var(--font-mono)" w:cs="Courier New"/>
           <w:color w:val="000000" w:themeColor="text1"/>
@@ -958,7 +943,7 @@
           <w:lang w:eastAsia="en-GB"/>
           <w14:ligatures w14:val="none"/>
         </w:rPr>
-        <w:t>Response: { "locations": ["Delhi", "Mumbai", "Punjab", "Karnataka"] }</w:t>
+        <w:t>Response: { "locations": ["National", "Northern", "Western", "Eastern", "Southern", "North-Eastern"] }</w:t>
       </w:r>
     </w:p>
     <w:p>
@@ -982,7 +967,6 @@
           <w:lang w:eastAsia="en-GB"/>
           <w14:ligatures w14:val="none"/>
         </w:rPr>
-        <w:lastRenderedPageBreak/>
         <w:t>2. Valid date range rules</w:t>
       </w:r>
       <w:r>

</xml_diff>